<commit_message>
update edit le fichier doc conception
</commit_message>
<xml_diff>
--- a/docs/sprint1/C61 - Document de Conception.docx
+++ b/docs/sprint1/C61 - Document de Conception.docx
@@ -259,7 +259,7 @@
     </w:p>
     <w:sdt>
       <w:sdtPr>
-        <w:id w:val="-823662723"/>
+        <w:id w:val="-870954281"/>
         <w:docPartObj>
           <w:docPartGallery w:val="Table of Contents"/>
           <w:docPartUnique w:val="1"/>
@@ -470,7 +470,7 @@
               </w:rPr>
               <w:t xml:space="preserve">Diagrammes de classe</w:t>
               <w:tab/>
-              <w:t xml:space="preserve">3</w:t>
+              <w:t xml:space="preserve">4</w:t>
             </w:r>
           </w:hyperlink>
           <w:r>
@@ -522,7 +522,7 @@
               </w:rPr>
               <w:t xml:space="preserve">Modèle(s) relationnel(s)</w:t>
               <w:tab/>
-              <w:t xml:space="preserve">3</w:t>
+              <w:t xml:space="preserve">4</w:t>
             </w:r>
           </w:hyperlink>
           <w:r>
@@ -574,7 +574,7 @@
               </w:rPr>
               <w:t xml:space="preserve">Maquettes</w:t>
               <w:tab/>
-              <w:t xml:space="preserve">3</w:t>
+              <w:t xml:space="preserve">5</w:t>
             </w:r>
           </w:hyperlink>
           <w:r>
@@ -626,7 +626,7 @@
               </w:rPr>
               <w:t xml:space="preserve">Éléments de conception</w:t>
               <w:tab/>
-              <w:t xml:space="preserve">3</w:t>
+              <w:t xml:space="preserve">11</w:t>
             </w:r>
           </w:hyperlink>
           <w:r>
@@ -679,7 +679,219 @@
               </w:rPr>
               <w:t xml:space="preserve">Justification des structures de données</w:t>
               <w:tab/>
-              <w:t xml:space="preserve">3</w:t>
+              <w:t xml:space="preserve">12</w:t>
+            </w:r>
+          </w:hyperlink>
+          <w:r>
+            <w:rPr>
+              <w:rtl w:val="0"/>
+            </w:rPr>
+          </w:r>
+        </w:p>
+        <w:p>
+          <w:pPr>
+            <w:widowControl w:val="0"/>
+            <w:tabs>
+              <w:tab w:val="right" w:leader="dot" w:pos="12000"/>
+            </w:tabs>
+            <w:spacing w:after="0" w:before="60" w:line="240" w:lineRule="auto"/>
+            <w:ind w:left="360" w:firstLine="0"/>
+            <w:rPr>
+              <w:rFonts w:ascii="Arial" w:cs="Arial" w:eastAsia="Arial" w:hAnsi="Arial"/>
+              <w:b w:val="0"/>
+              <w:bCs w:val="0"/>
+              <w:i w:val="0"/>
+              <w:iCs w:val="0"/>
+              <w:smallCaps w:val="0"/>
+              <w:strike w:val="0"/>
+              <w:color w:val="000000"/>
+              <w:sz w:val="22"/>
+              <w:szCs w:val="22"/>
+              <w:u w:val="none"/>
+              <w:shd w:fill="auto" w:val="clear"/>
+              <w:vertAlign w:val="baseline"/>
+            </w:rPr>
+          </w:pPr>
+          <w:hyperlink w:anchor="_rdnuv21pxv1n">
+            <w:r>
+              <w:rPr>
+                <w:rFonts w:ascii="Arial" w:cs="Arial" w:eastAsia="Arial" w:hAnsi="Arial"/>
+                <w:b w:val="0"/>
+                <w:bCs w:val="0"/>
+                <w:i w:val="0"/>
+                <w:iCs w:val="0"/>
+                <w:smallCaps w:val="0"/>
+                <w:strike w:val="0"/>
+                <w:color w:val="000000"/>
+                <w:sz w:val="22"/>
+                <w:szCs w:val="22"/>
+                <w:u w:val="none"/>
+                <w:shd w:fill="auto" w:val="clear"/>
+                <w:vertAlign w:val="baseline"/>
+                <w:rtl w:val="0"/>
+              </w:rPr>
+              <w:t xml:space="preserve">credits</w:t>
+              <w:tab/>
+              <w:t xml:space="preserve">12</w:t>
+            </w:r>
+          </w:hyperlink>
+          <w:r>
+            <w:rPr>
+              <w:rtl w:val="0"/>
+            </w:rPr>
+          </w:r>
+        </w:p>
+        <w:p>
+          <w:pPr>
+            <w:widowControl w:val="0"/>
+            <w:tabs>
+              <w:tab w:val="right" w:leader="dot" w:pos="12000"/>
+            </w:tabs>
+            <w:spacing w:after="0" w:before="60" w:line="240" w:lineRule="auto"/>
+            <w:ind w:left="360" w:firstLine="0"/>
+            <w:rPr>
+              <w:rFonts w:ascii="Arial" w:cs="Arial" w:eastAsia="Arial" w:hAnsi="Arial"/>
+              <w:b w:val="0"/>
+              <w:bCs w:val="0"/>
+              <w:i w:val="0"/>
+              <w:iCs w:val="0"/>
+              <w:smallCaps w:val="0"/>
+              <w:strike w:val="0"/>
+              <w:color w:val="000000"/>
+              <w:sz w:val="22"/>
+              <w:szCs w:val="22"/>
+              <w:u w:val="none"/>
+              <w:shd w:fill="auto" w:val="clear"/>
+              <w:vertAlign w:val="baseline"/>
+            </w:rPr>
+          </w:pPr>
+          <w:hyperlink w:anchor="_myb5rno1wopz">
+            <w:r>
+              <w:rPr>
+                <w:rFonts w:ascii="Arial" w:cs="Arial" w:eastAsia="Arial" w:hAnsi="Arial"/>
+                <w:b w:val="0"/>
+                <w:bCs w:val="0"/>
+                <w:i w:val="0"/>
+                <w:iCs w:val="0"/>
+                <w:smallCaps w:val="0"/>
+                <w:strike w:val="0"/>
+                <w:color w:val="000000"/>
+                <w:sz w:val="22"/>
+                <w:szCs w:val="22"/>
+                <w:u w:val="none"/>
+                <w:shd w:fill="auto" w:val="clear"/>
+                <w:vertAlign w:val="baseline"/>
+                <w:rtl w:val="0"/>
+              </w:rPr>
+              <w:t xml:space="preserve">profiles</w:t>
+              <w:tab/>
+              <w:t xml:space="preserve">12</w:t>
+            </w:r>
+          </w:hyperlink>
+          <w:r>
+            <w:rPr>
+              <w:rtl w:val="0"/>
+            </w:rPr>
+          </w:r>
+        </w:p>
+        <w:p>
+          <w:pPr>
+            <w:widowControl w:val="0"/>
+            <w:tabs>
+              <w:tab w:val="right" w:leader="dot" w:pos="12000"/>
+            </w:tabs>
+            <w:spacing w:after="0" w:before="60" w:line="240" w:lineRule="auto"/>
+            <w:ind w:left="360" w:firstLine="0"/>
+            <w:rPr>
+              <w:rFonts w:ascii="Arial" w:cs="Arial" w:eastAsia="Arial" w:hAnsi="Arial"/>
+              <w:b w:val="0"/>
+              <w:bCs w:val="0"/>
+              <w:i w:val="0"/>
+              <w:iCs w:val="0"/>
+              <w:smallCaps w:val="0"/>
+              <w:strike w:val="0"/>
+              <w:color w:val="000000"/>
+              <w:sz w:val="22"/>
+              <w:szCs w:val="22"/>
+              <w:u w:val="none"/>
+              <w:shd w:fill="auto" w:val="clear"/>
+              <w:vertAlign w:val="baseline"/>
+            </w:rPr>
+          </w:pPr>
+          <w:hyperlink w:anchor="_cjlqyigypj1j">
+            <w:r>
+              <w:rPr>
+                <w:rFonts w:ascii="Arial" w:cs="Arial" w:eastAsia="Arial" w:hAnsi="Arial"/>
+                <w:b w:val="0"/>
+                <w:bCs w:val="0"/>
+                <w:i w:val="0"/>
+                <w:iCs w:val="0"/>
+                <w:smallCaps w:val="0"/>
+                <w:strike w:val="0"/>
+                <w:color w:val="000000"/>
+                <w:sz w:val="22"/>
+                <w:szCs w:val="22"/>
+                <w:u w:val="none"/>
+                <w:shd w:fill="auto" w:val="clear"/>
+                <w:vertAlign w:val="baseline"/>
+                <w:rtl w:val="0"/>
+              </w:rPr>
+              <w:t xml:space="preserve">news</w:t>
+              <w:tab/>
+              <w:t xml:space="preserve">13</w:t>
+            </w:r>
+          </w:hyperlink>
+          <w:r>
+            <w:rPr>
+              <w:rtl w:val="0"/>
+            </w:rPr>
+          </w:r>
+        </w:p>
+        <w:p>
+          <w:pPr>
+            <w:widowControl w:val="0"/>
+            <w:tabs>
+              <w:tab w:val="right" w:leader="dot" w:pos="12000"/>
+            </w:tabs>
+            <w:spacing w:after="0" w:before="60" w:line="240" w:lineRule="auto"/>
+            <w:ind w:left="360" w:firstLine="0"/>
+            <w:rPr>
+              <w:rFonts w:ascii="Arial" w:cs="Arial" w:eastAsia="Arial" w:hAnsi="Arial"/>
+              <w:b w:val="0"/>
+              <w:bCs w:val="0"/>
+              <w:i w:val="0"/>
+              <w:iCs w:val="0"/>
+              <w:smallCaps w:val="0"/>
+              <w:strike w:val="0"/>
+              <w:color w:val="000000"/>
+              <w:sz w:val="22"/>
+              <w:szCs w:val="22"/>
+              <w:u w:val="none"/>
+              <w:shd w:fill="auto" w:val="clear"/>
+              <w:vertAlign w:val="baseline"/>
+            </w:rPr>
+          </w:pPr>
+          <w:hyperlink w:anchor="_e90hbaaf53jy">
+            <w:r>
+              <w:rPr>
+                <w:rFonts w:ascii="Arial" w:cs="Arial" w:eastAsia="Arial" w:hAnsi="Arial"/>
+                <w:b w:val="0"/>
+                <w:bCs w:val="0"/>
+                <w:i w:val="0"/>
+                <w:iCs w:val="0"/>
+                <w:smallCaps w:val="0"/>
+                <w:strike w:val="0"/>
+                <w:color w:val="000000"/>
+                <w:sz w:val="22"/>
+                <w:szCs w:val="22"/>
+                <w:u w:val="none"/>
+                <w:shd w:fill="auto" w:val="clear"/>
+                <w:vertAlign w:val="baseline"/>
+                <w:rtl w:val="0"/>
+              </w:rPr>
+              <w:t xml:space="preserve">savedGames</w:t>
+              <w:tab/>
+              <w:t xml:space="preserve">13</w:t>
             </w:r>
           </w:hyperlink>
           <w:r>
@@ -732,7 +944,7 @@
               </w:rPr>
               <w:t xml:space="preserve">Justification des patrons de conception</w:t>
               <w:tab/>
-              <w:t xml:space="preserve">3</w:t>
+              <w:t xml:space="preserve">14</w:t>
             </w:r>
           </w:hyperlink>
           <w:r>
@@ -785,7 +997,7 @@
               </w:rPr>
               <w:t xml:space="preserve">Composite (Object Tree)</w:t>
               <w:tab/>
-              <w:t xml:space="preserve">3</w:t>
+              <w:t xml:space="preserve">14</w:t>
             </w:r>
           </w:hyperlink>
           <w:r>
@@ -838,7 +1050,7 @@
               </w:rPr>
               <w:t xml:space="preserve">Flyweight</w:t>
               <w:tab/>
-              <w:t xml:space="preserve">4</w:t>
+              <w:t xml:space="preserve">14</w:t>
             </w:r>
           </w:hyperlink>
           <w:r>
@@ -891,7 +1103,7 @@
               </w:rPr>
               <w:t xml:space="preserve">State</w:t>
               <w:tab/>
-              <w:t xml:space="preserve">4</w:t>
+              <w:t xml:space="preserve">14</w:t>
             </w:r>
           </w:hyperlink>
           <w:r>
@@ -944,7 +1156,7 @@
               </w:rPr>
               <w:t xml:space="preserve">Command</w:t>
               <w:tab/>
-              <w:t xml:space="preserve">5</w:t>
+              <w:t xml:space="preserve">15</w:t>
             </w:r>
           </w:hyperlink>
           <w:r>
@@ -997,7 +1209,7 @@
               </w:rPr>
               <w:t xml:space="preserve">Intégration individuelle du projet de recherche de Veille technologique</w:t>
               <w:tab/>
-              <w:t xml:space="preserve">5</w:t>
+              <w:t xml:space="preserve">15</w:t>
             </w:r>
           </w:hyperlink>
           <w:r>
@@ -1070,16 +1282,16 @@
           <wp:inline distB="114300" distT="114300" distL="114300" distR="114300">
             <wp:extent cx="5943600" cy="7061200"/>
             <wp:effectExtent b="0" l="0" r="0" t="0"/>
-            <wp:docPr id="3" name="image6.png"/>
+            <wp:docPr id="3" name="image4.png"/>
             <a:graphic>
               <a:graphicData uri="http://schemas.openxmlformats.org/drawingml/2006/picture">
                 <pic:pic>
                   <pic:nvPicPr>
-                    <pic:cNvPr id="0" name="image6.png"/>
+                    <pic:cNvPr id="0" name="image4.png"/>
                     <pic:cNvPicPr preferRelativeResize="0"/>
                   </pic:nvPicPr>
                   <pic:blipFill>
-                    <a:blip r:embed="rId7"/>
+                    <a:blip r:embed="rId6"/>
                     <a:srcRect b="0" l="0" r="0" t="0"/>
                     <a:stretch>
                       <a:fillRect/>
@@ -1135,21 +1347,53 @@
         <w:rPr/>
       </w:pPr>
       <w:r>
+        <w:rPr>
+          <w:rtl w:val="0"/>
+        </w:rPr>
+        <w:t xml:space="preserve">Diagramme de Classe - Personnage</w:t>
+      </w:r>
+    </w:p>
+    <w:p>
+      <w:pPr>
+        <w:rPr/>
+      </w:pPr>
+      <w:r>
+        <w:rPr>
+          <w:rtl w:val="0"/>
+        </w:rPr>
+        <w:t xml:space="preserve">Le personnage de base est un assortiment de Node3D</w:t>
+      </w:r>
+    </w:p>
+    <w:p>
+      <w:pPr>
+        <w:rPr/>
+      </w:pPr>
+      <w:r>
+        <w:rPr>
+          <w:rtl w:val="0"/>
+        </w:rPr>
+      </w:r>
+    </w:p>
+    <w:p>
+      <w:pPr>
+        <w:rPr/>
+      </w:pPr>
+      <w:r>
         <w:rPr/>
         <w:drawing>
           <wp:inline distB="114300" distT="114300" distL="114300" distR="114300">
             <wp:extent cx="3424398" cy="4961486"/>
             <wp:effectExtent b="0" l="0" r="0" t="0"/>
-            <wp:docPr id="14" name="image4.png"/>
+            <wp:docPr id="14" name="image6.png"/>
             <a:graphic>
               <a:graphicData uri="http://schemas.openxmlformats.org/drawingml/2006/picture">
                 <pic:pic>
                   <pic:nvPicPr>
-                    <pic:cNvPr id="0" name="image4.png"/>
+                    <pic:cNvPr id="0" name="image6.png"/>
                     <pic:cNvPicPr preferRelativeResize="0"/>
                   </pic:nvPicPr>
                   <pic:blipFill>
-                    <a:blip r:embed="rId8"/>
+                    <a:blip r:embed="rId7"/>
                     <a:srcRect b="0" l="0" r="0" t="0"/>
                     <a:stretch>
                       <a:fillRect/>
@@ -1205,21 +1449,50 @@
         <w:rPr/>
       </w:pPr>
       <w:r>
+        <w:rPr>
+          <w:rtl w:val="0"/>
+        </w:rPr>
+        <w:t xml:space="preserve">Explication des catégories de relations:</w:t>
+      </w:r>
+    </w:p>
+    <w:p>
+      <w:pPr>
+        <w:numPr>
+          <w:ilvl w:val="0"/>
+          <w:numId w:val="1"/>
+        </w:numPr>
+        <w:ind w:left="720" w:hanging="360"/>
+        <w:rPr>
+          <w:u w:val="none"/>
+        </w:rPr>
+      </w:pPr>
+      <w:r>
+        <w:rPr>
+          <w:rtl w:val="0"/>
+        </w:rPr>
+        <w:t xml:space="preserve">Clients : Les joueurs</w:t>
+      </w:r>
+    </w:p>
+    <w:p>
+      <w:pPr>
+        <w:rPr/>
+      </w:pPr>
+      <w:r>
         <w:rPr/>
         <w:drawing>
           <wp:inline distB="114300" distT="114300" distL="114300" distR="114300">
             <wp:extent cx="6138863" cy="5107725"/>
             <wp:effectExtent b="0" l="0" r="0" t="0"/>
-            <wp:docPr id="9" name="image8.png"/>
+            <wp:docPr id="9" name="image7.png"/>
             <a:graphic>
               <a:graphicData uri="http://schemas.openxmlformats.org/drawingml/2006/picture">
                 <pic:pic>
                   <pic:nvPicPr>
-                    <pic:cNvPr id="0" name="image8.png"/>
+                    <pic:cNvPr id="0" name="image7.png"/>
                     <pic:cNvPicPr preferRelativeResize="0"/>
                   </pic:nvPicPr>
                   <pic:blipFill>
-                    <a:blip r:embed="rId9"/>
+                    <a:blip r:embed="rId8"/>
                     <a:srcRect b="0" l="0" r="0" t="0"/>
                     <a:stretch>
                       <a:fillRect/>
@@ -1269,7 +1542,7 @@
         </w:rPr>
         <w:t xml:space="preserve">Les maquettes ont été fabriquées avec l’aide du Logiciel Libre-Source </w:t>
       </w:r>
-      <w:hyperlink r:id="rId10">
+      <w:hyperlink r:id="rId9">
         <w:r>
           <w:rPr>
             <w:color w:val="1155cc"/>
@@ -1302,6 +1575,41 @@
                 <pic:pic>
                   <pic:nvPicPr>
                     <pic:cNvPr id="0" name="image1.png"/>
+                    <pic:cNvPicPr preferRelativeResize="0"/>
+                  </pic:nvPicPr>
+                  <pic:blipFill>
+                    <a:blip r:embed="rId10"/>
+                    <a:srcRect b="0" l="0" r="0" t="0"/>
+                    <a:stretch>
+                      <a:fillRect/>
+                    </a:stretch>
+                  </pic:blipFill>
+                  <pic:spPr>
+                    <a:xfrm>
+                      <a:off x="0" y="0"/>
+                      <a:ext cx="5943600" cy="3479800"/>
+                    </a:xfrm>
+                    <a:prstGeom prst="rect"/>
+                    <a:ln/>
+                  </pic:spPr>
+                </pic:pic>
+              </a:graphicData>
+            </a:graphic>
+          </wp:inline>
+        </w:drawing>
+      </w:r>
+      <w:r>
+        <w:rPr/>
+        <w:drawing>
+          <wp:inline distB="114300" distT="114300" distL="114300" distR="114300">
+            <wp:extent cx="5943600" cy="3479800"/>
+            <wp:effectExtent b="0" l="0" r="0" t="0"/>
+            <wp:docPr id="11" name="image8.png"/>
+            <a:graphic>
+              <a:graphicData uri="http://schemas.openxmlformats.org/drawingml/2006/picture">
+                <pic:pic>
+                  <pic:nvPicPr>
+                    <pic:cNvPr id="0" name="image8.png"/>
                     <pic:cNvPicPr preferRelativeResize="0"/>
                   </pic:nvPicPr>
                   <pic:blipFill>
@@ -1331,7 +1639,7 @@
           <wp:inline distB="114300" distT="114300" distL="114300" distR="114300">
             <wp:extent cx="5943600" cy="3479800"/>
             <wp:effectExtent b="0" l="0" r="0" t="0"/>
-            <wp:docPr id="11" name="image3.png"/>
+            <wp:docPr id="16" name="image3.png"/>
             <a:graphic>
               <a:graphicData uri="http://schemas.openxmlformats.org/drawingml/2006/picture">
                 <pic:pic>
@@ -1366,7 +1674,7 @@
           <wp:inline distB="114300" distT="114300" distL="114300" distR="114300">
             <wp:extent cx="5943600" cy="3479800"/>
             <wp:effectExtent b="0" l="0" r="0" t="0"/>
-            <wp:docPr id="16" name="image2.png"/>
+            <wp:docPr id="6" name="image2.png"/>
             <a:graphic>
               <a:graphicData uri="http://schemas.openxmlformats.org/drawingml/2006/picture">
                 <pic:pic>
@@ -1396,17 +1704,27 @@
         </w:drawing>
       </w:r>
       <w:r>
+        <w:rPr>
+          <w:rtl w:val="0"/>
+        </w:rPr>
+      </w:r>
+    </w:p>
+    <w:p>
+      <w:pPr>
+        <w:rPr/>
+      </w:pPr>
+      <w:r>
         <w:rPr/>
         <w:drawing>
           <wp:inline distB="114300" distT="114300" distL="114300" distR="114300">
-            <wp:extent cx="5943600" cy="3479800"/>
+            <wp:extent cx="5943600" cy="3403600"/>
             <wp:effectExtent b="0" l="0" r="0" t="0"/>
-            <wp:docPr id="6" name="image5.png"/>
+            <wp:docPr id="13" name="image14.png"/>
             <a:graphic>
               <a:graphicData uri="http://schemas.openxmlformats.org/drawingml/2006/picture">
                 <pic:pic>
                   <pic:nvPicPr>
-                    <pic:cNvPr id="0" name="image5.png"/>
+                    <pic:cNvPr id="0" name="image14.png"/>
                     <pic:cNvPicPr preferRelativeResize="0"/>
                   </pic:nvPicPr>
                   <pic:blipFill>
@@ -1419,7 +1737,7 @@
                   <pic:spPr>
                     <a:xfrm>
                       <a:off x="0" y="0"/>
-                      <a:ext cx="5943600" cy="3479800"/>
+                      <a:ext cx="5943600" cy="3403600"/>
                     </a:xfrm>
                     <a:prstGeom prst="rect"/>
                     <a:ln/>
@@ -1431,27 +1749,17 @@
         </w:drawing>
       </w:r>
       <w:r>
-        <w:rPr>
-          <w:rtl w:val="0"/>
-        </w:rPr>
-      </w:r>
-    </w:p>
-    <w:p>
-      <w:pPr>
-        <w:rPr/>
-      </w:pPr>
-      <w:r>
         <w:rPr/>
         <w:drawing>
           <wp:inline distB="114300" distT="114300" distL="114300" distR="114300">
             <wp:extent cx="5943600" cy="3403600"/>
             <wp:effectExtent b="0" l="0" r="0" t="0"/>
-            <wp:docPr id="13" name="image11.png"/>
+            <wp:docPr id="10" name="image10.png"/>
             <a:graphic>
               <a:graphicData uri="http://schemas.openxmlformats.org/drawingml/2006/picture">
                 <pic:pic>
                   <pic:nvPicPr>
-                    <pic:cNvPr id="0" name="image11.png"/>
+                    <pic:cNvPr id="0" name="image10.png"/>
                     <pic:cNvPicPr preferRelativeResize="0"/>
                   </pic:nvPicPr>
                   <pic:blipFill>
@@ -1481,12 +1789,12 @@
           <wp:inline distB="114300" distT="114300" distL="114300" distR="114300">
             <wp:extent cx="5943600" cy="3403600"/>
             <wp:effectExtent b="0" l="0" r="0" t="0"/>
-            <wp:docPr id="10" name="image12.png"/>
+            <wp:docPr id="5" name="image9.png"/>
             <a:graphic>
               <a:graphicData uri="http://schemas.openxmlformats.org/drawingml/2006/picture">
                 <pic:pic>
                   <pic:nvPicPr>
-                    <pic:cNvPr id="0" name="image12.png"/>
+                    <pic:cNvPr id="0" name="image9.png"/>
                     <pic:cNvPicPr preferRelativeResize="0"/>
                   </pic:nvPicPr>
                   <pic:blipFill>
@@ -1516,12 +1824,12 @@
           <wp:inline distB="114300" distT="114300" distL="114300" distR="114300">
             <wp:extent cx="5943600" cy="3403600"/>
             <wp:effectExtent b="0" l="0" r="0" t="0"/>
-            <wp:docPr id="5" name="image9.png"/>
+            <wp:docPr id="1" name="image11.png"/>
             <a:graphic>
               <a:graphicData uri="http://schemas.openxmlformats.org/drawingml/2006/picture">
                 <pic:pic>
                   <pic:nvPicPr>
-                    <pic:cNvPr id="0" name="image9.png"/>
+                    <pic:cNvPr id="0" name="image11.png"/>
                     <pic:cNvPicPr preferRelativeResize="0"/>
                   </pic:nvPicPr>
                   <pic:blipFill>
@@ -1551,12 +1859,12 @@
           <wp:inline distB="114300" distT="114300" distL="114300" distR="114300">
             <wp:extent cx="5943600" cy="3403600"/>
             <wp:effectExtent b="0" l="0" r="0" t="0"/>
-            <wp:docPr id="1" name="image14.png"/>
+            <wp:docPr id="8" name="image13.png"/>
             <a:graphic>
               <a:graphicData uri="http://schemas.openxmlformats.org/drawingml/2006/picture">
                 <pic:pic>
                   <pic:nvPicPr>
-                    <pic:cNvPr id="0" name="image14.png"/>
+                    <pic:cNvPr id="0" name="image13.png"/>
                     <pic:cNvPicPr preferRelativeResize="0"/>
                   </pic:nvPicPr>
                   <pic:blipFill>
@@ -1586,7 +1894,7 @@
           <wp:inline distB="114300" distT="114300" distL="114300" distR="114300">
             <wp:extent cx="5943600" cy="3403600"/>
             <wp:effectExtent b="0" l="0" r="0" t="0"/>
-            <wp:docPr id="8" name="image16.png"/>
+            <wp:docPr id="4" name="image16.png"/>
             <a:graphic>
               <a:graphicData uri="http://schemas.openxmlformats.org/drawingml/2006/picture">
                 <pic:pic>
@@ -1621,12 +1929,12 @@
           <wp:inline distB="114300" distT="114300" distL="114300" distR="114300">
             <wp:extent cx="5943600" cy="3403600"/>
             <wp:effectExtent b="0" l="0" r="0" t="0"/>
-            <wp:docPr id="4" name="image13.png"/>
+            <wp:docPr id="12" name="image15.png"/>
             <a:graphic>
               <a:graphicData uri="http://schemas.openxmlformats.org/drawingml/2006/picture">
                 <pic:pic>
                   <pic:nvPicPr>
-                    <pic:cNvPr id="0" name="image13.png"/>
+                    <pic:cNvPr id="0" name="image15.png"/>
                     <pic:cNvPicPr preferRelativeResize="0"/>
                   </pic:nvPicPr>
                   <pic:blipFill>
@@ -1656,12 +1964,12 @@
           <wp:inline distB="114300" distT="114300" distL="114300" distR="114300">
             <wp:extent cx="5943600" cy="3403600"/>
             <wp:effectExtent b="0" l="0" r="0" t="0"/>
-            <wp:docPr id="12" name="image15.png"/>
+            <wp:docPr id="15" name="image12.png"/>
             <a:graphic>
               <a:graphicData uri="http://schemas.openxmlformats.org/drawingml/2006/picture">
                 <pic:pic>
                   <pic:nvPicPr>
-                    <pic:cNvPr id="0" name="image15.png"/>
+                    <pic:cNvPr id="0" name="image12.png"/>
                     <pic:cNvPicPr preferRelativeResize="0"/>
                   </pic:nvPicPr>
                   <pic:blipFill>
@@ -1686,118 +1994,83 @@
         </w:drawing>
       </w:r>
       <w:r>
+        <w:rPr>
+          <w:rtl w:val="0"/>
+        </w:rPr>
+      </w:r>
+    </w:p>
+    <w:p>
+      <w:pPr>
+        <w:pStyle w:val="Heading1"/>
+        <w:rPr/>
+      </w:pPr>
+      <w:bookmarkStart w:colFirst="0" w:colLast="0" w:name="_fsz68jk8k3o2" w:id="8"/>
+      <w:bookmarkEnd w:id="8"/>
+      <w:r>
+        <w:rPr>
+          <w:rtl w:val="0"/>
+        </w:rPr>
+        <w:t xml:space="preserve">Éléments de conception</w:t>
+      </w:r>
+    </w:p>
+    <w:p>
+      <w:pPr>
+        <w:spacing w:after="200" w:lineRule="auto"/>
+        <w:rPr/>
+      </w:pPr>
+      <w:r>
+        <w:rPr>
+          <w:rtl w:val="0"/>
+        </w:rPr>
+        <w:t xml:space="preserve"> </w:t>
+      </w:r>
+    </w:p>
+    <w:p>
+      <w:pPr>
+        <w:pStyle w:val="Heading2"/>
+        <w:rPr/>
+      </w:pPr>
+      <w:bookmarkStart w:colFirst="0" w:colLast="0" w:name="_ayy3x0auswl4" w:id="9"/>
+      <w:bookmarkEnd w:id="9"/>
+      <w:r>
+        <w:rPr>
+          <w:rtl w:val="0"/>
+        </w:rPr>
+        <w:t xml:space="preserve">Justification des structures de données</w:t>
+      </w:r>
+      <w:r>
+        <w:rPr>
+          <w:rtl w:val="0"/>
+        </w:rPr>
+      </w:r>
+    </w:p>
+    <w:p>
+      <w:pPr>
+        <w:spacing w:after="200" w:lineRule="auto"/>
+        <w:rPr/>
+      </w:pPr>
+      <w:r>
+        <w:rPr>
+          <w:rtl w:val="0"/>
+        </w:rPr>
+        <w:t xml:space="preserve"> </w:t>
+      </w:r>
+      <w:r>
         <w:rPr/>
         <w:drawing>
           <wp:inline distB="114300" distT="114300" distL="114300" distR="114300">
-            <wp:extent cx="5943600" cy="3403600"/>
+            <wp:extent cx="5650127" cy="4394543"/>
             <wp:effectExtent b="0" l="0" r="0" t="0"/>
-            <wp:docPr id="15" name="image10.png"/>
+            <wp:docPr id="7" name="image5.png"/>
             <a:graphic>
               <a:graphicData uri="http://schemas.openxmlformats.org/drawingml/2006/picture">
                 <pic:pic>
                   <pic:nvPicPr>
-                    <pic:cNvPr id="0" name="image10.png"/>
+                    <pic:cNvPr id="0" name="image5.png"/>
                     <pic:cNvPicPr preferRelativeResize="0"/>
                   </pic:nvPicPr>
                   <pic:blipFill>
                     <a:blip r:embed="rId22"/>
-                    <a:srcRect b="0" l="0" r="0" t="0"/>
-                    <a:stretch>
-                      <a:fillRect/>
-                    </a:stretch>
-                  </pic:blipFill>
-                  <pic:spPr>
-                    <a:xfrm>
-                      <a:off x="0" y="0"/>
-                      <a:ext cx="5943600" cy="3403600"/>
-                    </a:xfrm>
-                    <a:prstGeom prst="rect"/>
-                    <a:ln/>
-                  </pic:spPr>
-                </pic:pic>
-              </a:graphicData>
-            </a:graphic>
-          </wp:inline>
-        </w:drawing>
-      </w:r>
-      <w:r>
-        <w:rPr>
-          <w:rtl w:val="0"/>
-        </w:rPr>
-      </w:r>
-    </w:p>
-    <w:p>
-      <w:pPr>
-        <w:pStyle w:val="Heading1"/>
-        <w:rPr/>
-      </w:pPr>
-      <w:bookmarkStart w:colFirst="0" w:colLast="0" w:name="_fsz68jk8k3o2" w:id="8"/>
-      <w:bookmarkEnd w:id="8"/>
-      <w:r>
-        <w:rPr>
-          <w:rtl w:val="0"/>
-        </w:rPr>
-        <w:t xml:space="preserve">Éléments de conception</w:t>
-      </w:r>
-    </w:p>
-    <w:p>
-      <w:pPr>
-        <w:spacing w:after="200" w:lineRule="auto"/>
-        <w:rPr/>
-      </w:pPr>
-      <w:r>
-        <w:rPr>
-          <w:rtl w:val="0"/>
-        </w:rPr>
-        <w:t xml:space="preserve"> </w:t>
-      </w:r>
-    </w:p>
-    <w:p>
-      <w:pPr>
-        <w:pStyle w:val="Heading2"/>
-        <w:rPr/>
-      </w:pPr>
-      <w:bookmarkStart w:colFirst="0" w:colLast="0" w:name="_ayy3x0auswl4" w:id="9"/>
-      <w:bookmarkEnd w:id="9"/>
-      <w:r>
-        <w:rPr>
-          <w:rtl w:val="0"/>
-        </w:rPr>
-        <w:t xml:space="preserve">Justification des structures de données</w:t>
-      </w:r>
-      <w:r>
-        <w:rPr>
-          <w:rtl w:val="0"/>
-        </w:rPr>
-      </w:r>
-    </w:p>
-    <w:p>
-      <w:pPr>
-        <w:spacing w:after="200" w:lineRule="auto"/>
-        <w:rPr/>
-      </w:pPr>
-      <w:r>
-        <w:rPr>
-          <w:rtl w:val="0"/>
-        </w:rPr>
-        <w:t xml:space="preserve"> </w:t>
-      </w:r>
-      <w:r>
-        <w:rPr/>
-        <w:drawing>
-          <wp:inline distB="114300" distT="114300" distL="114300" distR="114300">
-            <wp:extent cx="5650127" cy="4394543"/>
-            <wp:effectExtent b="0" l="0" r="0" t="0"/>
-            <wp:docPr id="7" name="image7.png"/>
-            <a:graphic>
-              <a:graphicData uri="http://schemas.openxmlformats.org/drawingml/2006/picture">
-                <pic:pic>
-                  <pic:nvPicPr>
-                    <pic:cNvPr id="0" name="image7.png"/>
-                    <pic:cNvPicPr preferRelativeResize="0"/>
-                  </pic:nvPicPr>
-                  <pic:blipFill>
-                    <a:blip r:embed="rId23"/>
                     <a:srcRect b="0" l="0" r="0" t="0"/>
                     <a:stretch>
                       <a:fillRect/>
@@ -1839,7 +2112,117 @@
     </w:p>
     <w:p>
       <w:pPr>
-        <w:spacing w:after="240" w:before="240" w:line="240" w:lineRule="auto"/>
+        <w:rPr/>
+      </w:pPr>
+      <w:r>
+        <w:rPr>
+          <w:rtl w:val="0"/>
+        </w:rPr>
+        <w:t xml:space="preserve">La collection credits sera utilisée pour stocker les informations affichées dans la section des crédits du jeu. Chaque document représente une personne ayant contribué au projet et contiendra son nom ainsi que son rôle (designer/programmeur etc…). Lorsqu’un joueur ouvre le menu des crédits dans le jeu, l’application récupère ces données depuis Firestore et les affiche à l’écran. De cette façon les personnes qui contribuent au projet n’auront pas besoin de hardcoder leur nom dans la page credit.</w:t>
+      </w:r>
+    </w:p>
+    <w:p>
+      <w:pPr>
+        <w:pStyle w:val="Heading2"/>
+        <w:rPr/>
+      </w:pPr>
+      <w:bookmarkStart w:colFirst="0" w:colLast="0" w:name="_myb5rno1wopz" w:id="11"/>
+      <w:bookmarkEnd w:id="11"/>
+      <w:r>
+        <w:rPr>
+          <w:rtl w:val="0"/>
+        </w:rPr>
+        <w:t xml:space="preserve">profiles</w:t>
+      </w:r>
+    </w:p>
+    <w:p>
+      <w:pPr>
+        <w:rPr/>
+      </w:pPr>
+      <w:r>
+        <w:rPr>
+          <w:rtl w:val="0"/>
+        </w:rPr>
+        <w:t xml:space="preserve">La collection profiles sera utilisée pour stocker les informations associées à chaque joueur, pour l’instant, son nom d’utilisateur. Chaque document correspond à un utilisateur et possède le même identifiant unique (uid) que celui généré par Firebase Authentication quand l’utilisateur se créer un compte. Lorsque le joueur se connecte, le jeu utilise cet identifiant pour récupérer son username et l’afficher dans l’interface, par exemple dans le menu ou en partie. Cette structure permet d’associer un nom d’utilisateur personnalisé à chaque compte tout en laissant Firebase gérer de façon sécurisée l’authentification.</w:t>
+      </w:r>
+    </w:p>
+    <w:p>
+      <w:pPr>
+        <w:rPr>
+          <w:u w:val="single"/>
+        </w:rPr>
+      </w:pPr>
+      <w:r>
+        <w:rPr>
+          <w:rtl w:val="0"/>
+        </w:rPr>
+      </w:r>
+    </w:p>
+    <w:p>
+      <w:pPr>
+        <w:rPr>
+          <w:u w:val="single"/>
+        </w:rPr>
+      </w:pPr>
+      <w:r>
+        <w:rPr>
+          <w:rtl w:val="0"/>
+        </w:rPr>
+      </w:r>
+    </w:p>
+    <w:p>
+      <w:pPr>
+        <w:pStyle w:val="Heading2"/>
+        <w:rPr/>
+      </w:pPr>
+      <w:bookmarkStart w:colFirst="0" w:colLast="0" w:name="_cjlqyigypj1j" w:id="12"/>
+      <w:bookmarkEnd w:id="12"/>
+      <w:r>
+        <w:rPr>
+          <w:rtl w:val="0"/>
+        </w:rPr>
+        <w:t xml:space="preserve">news</w:t>
+      </w:r>
+    </w:p>
+    <w:p>
+      <w:pPr>
+        <w:rPr/>
+      </w:pPr>
+      <w:r>
+        <w:rPr>
+          <w:rtl w:val="0"/>
+        </w:rPr>
+        <w:t xml:space="preserve">La collection news sera utilisée pour stocker les annonces et informations affichées dans le menu principal du jeu. Chaque document contiendra un titre, un message et une date de publication. Lorsque le joueur ouvre le menu principal, le jeu récupère ces données depuis Firestore afin de montrer les nouvelles récentes. Cette approche permet de modifier ou d’ajouter des annonces facilement sans avoir à hardcoder les nouvelles dans la page de news.</w:t>
+      </w:r>
+    </w:p>
+    <w:p>
+      <w:pPr>
+        <w:pStyle w:val="Heading2"/>
+        <w:rPr/>
+      </w:pPr>
+      <w:bookmarkStart w:colFirst="0" w:colLast="0" w:name="_e90hbaaf53jy" w:id="13"/>
+      <w:bookmarkEnd w:id="13"/>
+      <w:r>
+        <w:rPr>
+          <w:rtl w:val="0"/>
+        </w:rPr>
+        <w:t xml:space="preserve">savedGames</w:t>
+      </w:r>
+    </w:p>
+    <w:p>
+      <w:pPr>
+        <w:rPr/>
+      </w:pPr>
+      <w:r>
+        <w:rPr>
+          <w:rtl w:val="0"/>
+        </w:rPr>
+        <w:t xml:space="preserve">La collection savedGames sera utilisée pour stocker les sauvegardes des parties, permettant aux joueurs de reprendre leur progression en chargeant une partie. Chaque document représente une sauvegarde créée par l’hôte de la partie et contient des informations générales comme le uid de l’hôte, le niveau actuel et la date. Le document contient également des structures de type map permettant de sauvegarder des données plus complexes. Par exemple, la structure levelStates enregistre l’état des différents objets du niveau, comme les leviers, portes ou boutons, sous forme de dictionnaire (exemple: "lever_1": true, "door_2": "open"... etc…). Une autre structure, playerPositions, permet de sauvegarder la position des joueurs sous forme de coordonnées (x, y, z). L’utilisation de ce format map permet de regrouper plusieurs informations liées dans un seul document et facilite la restauration de l’état du niveau lors du chargement d’une partie.</w:t>
+      </w:r>
+    </w:p>
+    <w:p>
+      <w:pPr>
+        <w:spacing w:after="200" w:line="240" w:lineRule="auto"/>
         <w:rPr>
           <w:rFonts w:ascii="Arial" w:cs="Arial" w:eastAsia="Arial" w:hAnsi="Arial"/>
           <w:sz w:val="20"/>
@@ -1848,152 +2231,6 @@
       </w:pPr>
       <w:r>
         <w:rPr>
-          <w:rFonts w:ascii="Arial" w:cs="Arial" w:eastAsia="Arial" w:hAnsi="Arial"/>
-          <w:sz w:val="20"/>
-          <w:szCs w:val="20"/>
-          <w:rtl w:val="0"/>
-        </w:rPr>
-        <w:t xml:space="preserve">La collection credits sera utilisée pour stocker les informations affichées dans la section des crédits du jeu. Chaque document représente une personne ayant contribué au projet et contiendra son nom ainsi que son rôle (designer/programmeur etc…). Lorsqu’un joueur ouvre le menu des crédits dans le jeu, l’application récupère ces données depuis Firestore et les affiche à l’écran. De cette façon les personnes qui contribuent au projet n’auront pas besoin de hardcoder leur nom dans la page credit</w:t>
-      </w:r>
-    </w:p>
-    <w:p>
-      <w:pPr>
-        <w:pStyle w:val="Heading2"/>
-        <w:rPr/>
-      </w:pPr>
-      <w:bookmarkStart w:colFirst="0" w:colLast="0" w:name="_myb5rno1wopz" w:id="11"/>
-      <w:bookmarkEnd w:id="11"/>
-      <w:r>
-        <w:rPr>
-          <w:rtl w:val="0"/>
-        </w:rPr>
-        <w:t xml:space="preserve">profiles</w:t>
-      </w:r>
-    </w:p>
-    <w:p>
-      <w:pPr>
-        <w:spacing w:after="240" w:before="240" w:line="240" w:lineRule="auto"/>
-        <w:rPr>
-          <w:rFonts w:ascii="Arial" w:cs="Arial" w:eastAsia="Arial" w:hAnsi="Arial"/>
-          <w:sz w:val="20"/>
-          <w:szCs w:val="20"/>
-        </w:rPr>
-      </w:pPr>
-      <w:r>
-        <w:rPr>
-          <w:rFonts w:ascii="Arial" w:cs="Arial" w:eastAsia="Arial" w:hAnsi="Arial"/>
-          <w:sz w:val="20"/>
-          <w:szCs w:val="20"/>
-          <w:rtl w:val="0"/>
-        </w:rPr>
-        <w:t xml:space="preserve">La collection profiles sera utilisée pour stocker les informations associées à chaque joueur, pour l’instant, son nom d’utilisateur. Chaque document correspond à un utilisateur et possède le même identifiant unique (uid) que celui généré par Firebase Authentication quand l’utilisateur se créer un compte. Lorsque le joueur se connecte, le jeu utilise cet identifiant pour récupérer son username et l’afficher dans l’interface, par exemple dans le menu ou en partie. Cette structure permet d’associer un nom d’utilisateur personnalisé à chaque compte tout en laissant Firebase gérer de façon sécurisée l’authentification.</w:t>
-      </w:r>
-    </w:p>
-    <w:p>
-      <w:pPr>
-        <w:rPr>
-          <w:u w:val="single"/>
-        </w:rPr>
-      </w:pPr>
-      <w:r>
-        <w:rPr>
-          <w:rtl w:val="0"/>
-        </w:rPr>
-      </w:r>
-    </w:p>
-    <w:p>
-      <w:pPr>
-        <w:rPr>
-          <w:u w:val="single"/>
-        </w:rPr>
-      </w:pPr>
-      <w:r>
-        <w:rPr>
-          <w:rtl w:val="0"/>
-        </w:rPr>
-      </w:r>
-    </w:p>
-    <w:p>
-      <w:pPr>
-        <w:pStyle w:val="Heading2"/>
-        <w:rPr/>
-      </w:pPr>
-      <w:bookmarkStart w:colFirst="0" w:colLast="0" w:name="_cjlqyigypj1j" w:id="12"/>
-      <w:bookmarkEnd w:id="12"/>
-      <w:r>
-        <w:rPr>
-          <w:rtl w:val="0"/>
-        </w:rPr>
-        <w:t xml:space="preserve">news</w:t>
-      </w:r>
-    </w:p>
-    <w:p>
-      <w:pPr>
-        <w:spacing w:after="240" w:before="240" w:line="240" w:lineRule="auto"/>
-        <w:rPr>
-          <w:rFonts w:ascii="Arial" w:cs="Arial" w:eastAsia="Arial" w:hAnsi="Arial"/>
-          <w:sz w:val="20"/>
-          <w:szCs w:val="20"/>
-        </w:rPr>
-      </w:pPr>
-      <w:r>
-        <w:rPr>
-          <w:rFonts w:ascii="Arial" w:cs="Arial" w:eastAsia="Arial" w:hAnsi="Arial"/>
-          <w:sz w:val="20"/>
-          <w:szCs w:val="20"/>
-          <w:rtl w:val="0"/>
-        </w:rPr>
-        <w:t xml:space="preserve">La collection news sera utilisée pour stocker les annonces et informations affichées dans le menu principal du jeu. Chaque document contiendra un titre, un message et une date de publication. Lorsque le joueur ouvre le menu principal, le jeu récupère ces données depuis Firestore afin de montrer les nouvelles récentes. Cette approche permet de modifier ou d’ajouter des annonces facilement sans avoir à hardcoder les nouvelles dans la page de news.</w:t>
-      </w:r>
-    </w:p>
-    <w:p>
-      <w:pPr>
-        <w:pStyle w:val="Heading2"/>
-        <w:rPr/>
-      </w:pPr>
-      <w:bookmarkStart w:colFirst="0" w:colLast="0" w:name="_e90hbaaf53jy" w:id="13"/>
-      <w:bookmarkEnd w:id="13"/>
-      <w:r>
-        <w:rPr>
-          <w:rtl w:val="0"/>
-        </w:rPr>
-        <w:t xml:space="preserve">savedGames</w:t>
-      </w:r>
-    </w:p>
-    <w:p>
-      <w:pPr>
-        <w:rPr>
-          <w:rFonts w:ascii="Arial" w:cs="Arial" w:eastAsia="Arial" w:hAnsi="Arial"/>
-          <w:sz w:val="14"/>
-          <w:szCs w:val="14"/>
-        </w:rPr>
-      </w:pPr>
-      <w:r>
-        <w:rPr>
-          <w:rFonts w:ascii="Arial" w:cs="Arial" w:eastAsia="Arial" w:hAnsi="Arial"/>
-          <w:sz w:val="20"/>
-          <w:szCs w:val="20"/>
-          <w:rtl w:val="0"/>
-        </w:rPr>
-        <w:t xml:space="preserve">La collection savedGames sera utilisée pour stocker les sauvegardes des parties, permettant aux joueurs de reprendre leur progression en chargeant une partie. Chaque document représente une sauvegarde créée par l’hôte de la partie et contient des informations générales comme le uid de l’hôte, le niveau actuel et la date. Le document contient également des structures de type map permettant de sauvegarder des données plus complexes. Par exemple, la structure levelStates enregistre l’état des différents objets du niveau, comme les leviers, portes ou boutons, sous forme de dictionnaire (exemple: "lever_1": true, "door_2": "open"... etc…). Une autre structure, playerPositions, permet de sauvegarder la position des joueurs sous forme de coordonnées (x, y, z). L’utilisation de ce format map permet de regrouper plusieurs informations liées dans un seul document et facilite la restauration de l’état du niveau lors du chargement d’une partie.</w:t>
-      </w:r>
-      <w:r>
-        <w:rPr>
-          <w:rtl w:val="0"/>
-        </w:rPr>
-      </w:r>
-    </w:p>
-    <w:p>
-      <w:pPr>
-        <w:spacing w:after="200" w:line="240" w:lineRule="auto"/>
-        <w:rPr>
-          <w:rFonts w:ascii="Arial" w:cs="Arial" w:eastAsia="Arial" w:hAnsi="Arial"/>
-          <w:sz w:val="20"/>
-          <w:szCs w:val="20"/>
-        </w:rPr>
-      </w:pPr>
-      <w:r>
-        <w:rPr>
           <w:rtl w:val="0"/>
         </w:rPr>
       </w:r>
@@ -2053,7 +2290,7 @@
         </w:rPr>
         <w:t xml:space="preserve">L’utilisation du patron de conception composite est primordial pour notre développement de jeu. Ce choix est largement justifié par notre choix d'engins de jeu, Godot, qui </w:t>
       </w:r>
-      <w:hyperlink r:id="rId24">
+      <w:hyperlink r:id="rId23">
         <w:r>
           <w:rPr>
             <w:color w:val="1155cc"/>
@@ -2069,7 +2306,7 @@
         </w:rPr>
         <w:t xml:space="preserve"> le cœur de l’engin. Autrement, la notion d’héritage par parenté est extrèmement pratique pour la création de jeu vidéos, ou nous pourrons créer des </w:t>
       </w:r>
-      <w:hyperlink r:id="rId25">
+      <w:hyperlink r:id="rId24">
         <w:r>
           <w:rPr>
             <w:color w:val="1155cc"/>
@@ -2103,7 +2340,6 @@
         <w:rPr>
           <w:rtl w:val="0"/>
         </w:rPr>
-        <w:t xml:space="preserve"> </w:t>
       </w:r>
     </w:p>
     <w:p>
@@ -2114,35 +2350,29 @@
         <w:spacing w:before="160" w:lineRule="auto"/>
         <w:rPr/>
       </w:pPr>
-      <w:bookmarkStart w:colFirst="0" w:colLast="0" w:name="_3zdsurz6c8r3" w:id="18"/>
+      <w:bookmarkStart w:colFirst="0" w:colLast="0" w:name="_gljcnr37slm3" w:id="18"/>
       <w:bookmarkEnd w:id="18"/>
       <w:r>
         <w:rPr>
           <w:rtl w:val="0"/>
         </w:rPr>
-        <w:t xml:space="preserve">Flyweight</w:t>
-      </w:r>
-    </w:p>
-    <w:p>
-      <w:pPr>
-        <w:rPr/>
-      </w:pPr>
-      <w:commentRangeStart w:id="0"/>
-      <w:r>
-        <w:rPr>
-          <w:rtl w:val="0"/>
-        </w:rPr>
-      </w:r>
-    </w:p>
-    <w:p>
-      <w:pPr>
-        <w:rPr/>
-      </w:pPr>
-      <w:r>
-        <w:rPr>
-          <w:rtl w:val="0"/>
-        </w:rPr>
-        <w:t xml:space="preserve">Le patron de conception </w:t>
+        <w:t xml:space="preserve">State</w:t>
+      </w:r>
+      <w:r>
+        <w:rPr>
+          <w:rtl w:val="0"/>
+        </w:rPr>
+      </w:r>
+    </w:p>
+    <w:p>
+      <w:pPr>
+        <w:rPr/>
+      </w:pPr>
+      <w:r>
+        <w:rPr>
+          <w:rtl w:val="0"/>
+        </w:rPr>
+        <w:t xml:space="preserve">Le patron de Conception </w:t>
       </w:r>
       <w:r>
         <w:rPr>
@@ -2150,116 +2380,6 @@
           <w:iCs w:val="1"/>
           <w:rtl w:val="0"/>
         </w:rPr>
-        <w:t xml:space="preserve">Flyweight</w:t>
-      </w:r>
-      <w:r>
-        <w:rPr>
-          <w:rtl w:val="0"/>
-        </w:rPr>
-        <w:t xml:space="preserve"> prend de l’importance pour la performance réseau du jeu. Au lieu d’envoyer au serveur une classe complète contenant le joueur, son modèle 3D, animations, etc., qui sera impraticable pour plusieurs joueurs (10 et plus), nous allons envoyer une classe d’instance avec seulement les informations pertinentes du joueur pour le serveur (son ID, sa position, un enum de son animation) par exemple, et la séparer du modèle 3D, des textures, etc. Par la suite, le client recevra ses informations et interpellera le reste (animations, modèles, etc.) selon le comportement des nouvelles positions ou entrées de données.  Considérant le prix de la mémoire actuellement, ce patron de conception</w:t>
-      </w:r>
-      <w:hyperlink r:id="rId26">
-        <w:r>
-          <w:rPr>
-            <w:color w:val="1155cc"/>
-            <w:u w:val="single"/>
-            <w:rtl w:val="0"/>
-          </w:rPr>
-          <w:t xml:space="preserve"> utilise plus la puissance du processeur que la mémoire</w:t>
-        </w:r>
-      </w:hyperlink>
-      <w:r>
-        <w:rPr>
-          <w:rtl w:val="0"/>
-        </w:rPr>
-        <w:t xml:space="preserve"> . </w:t>
-      </w:r>
-      <w:r>
-        <w:rPr>
-          <w:rtl w:val="0"/>
-        </w:rPr>
-      </w:r>
-    </w:p>
-    <w:p>
-      <w:pPr>
-        <w:rPr/>
-      </w:pPr>
-      <w:r>
-        <w:rPr>
-          <w:rtl w:val="0"/>
-        </w:rPr>
-        <w:t xml:space="preserve">Ce patron de conception peut aussi être utilisé pour les particules, </w:t>
-      </w:r>
-      <w:hyperlink r:id="rId27">
-        <w:r>
-          <w:rPr>
-            <w:color w:val="1155cc"/>
-            <w:u w:val="single"/>
-            <w:rtl w:val="0"/>
-          </w:rPr>
-          <w:t xml:space="preserve">les objets sur la carte</w:t>
-        </w:r>
-      </w:hyperlink>
-      <w:r>
-        <w:rPr>
-          <w:rtl w:val="0"/>
-        </w:rPr>
-        <w:t xml:space="preserve"> (cailloux, etc.) au niveau client pour éviter d’utiliser la mémoire à tort</w:t>
-      </w:r>
-      <w:r>
-        <w:rPr>
-          <w:rtl w:val="0"/>
-        </w:rPr>
-        <w:t xml:space="preserve"> </w:t>
-      </w:r>
-      <w:commentRangeEnd w:id="0"/>
-      <w:r>
-        <w:commentReference w:id="0"/>
-      </w:r>
-      <w:r>
-        <w:rPr>
-          <w:rtl w:val="0"/>
-        </w:rPr>
-      </w:r>
-    </w:p>
-    <w:p>
-      <w:pPr>
-        <w:pStyle w:val="Heading3"/>
-        <w:keepNext w:val="0"/>
-        <w:keepLines w:val="0"/>
-        <w:spacing w:before="160" w:lineRule="auto"/>
-        <w:rPr/>
-      </w:pPr>
-      <w:bookmarkStart w:colFirst="0" w:colLast="0" w:name="_gljcnr37slm3" w:id="19"/>
-      <w:bookmarkEnd w:id="19"/>
-      <w:r>
-        <w:rPr>
-          <w:rtl w:val="0"/>
-        </w:rPr>
-        <w:t xml:space="preserve">State</w:t>
-      </w:r>
-      <w:r>
-        <w:rPr>
-          <w:rtl w:val="0"/>
-        </w:rPr>
-      </w:r>
-    </w:p>
-    <w:p>
-      <w:pPr>
-        <w:rPr/>
-      </w:pPr>
-      <w:r>
-        <w:rPr>
-          <w:rtl w:val="0"/>
-        </w:rPr>
-        <w:t xml:space="preserve">Le patron de Conception </w:t>
-      </w:r>
-      <w:r>
-        <w:rPr>
-          <w:i w:val="1"/>
-          <w:iCs w:val="1"/>
-          <w:rtl w:val="0"/>
-        </w:rPr>
         <w:t xml:space="preserve">State</w:t>
       </w:r>
       <w:r>
@@ -2273,7 +2393,7 @@
       <w:pPr>
         <w:numPr>
           <w:ilvl w:val="0"/>
-          <w:numId w:val="1"/>
+          <w:numId w:val="2"/>
         </w:numPr>
         <w:spacing w:after="0" w:afterAutospacing="0"/>
         <w:ind w:left="720" w:hanging="360"/>
@@ -2287,7 +2407,7 @@
           <w:bCs w:val="1"/>
           <w:rtl w:val="0"/>
         </w:rPr>
-        <w:t xml:space="preserve">Lier des pointeurs a des ressources</w:t>
+        <w:t xml:space="preserve">Lier des pointeurs a des ressources (STATE MACHINE)</w:t>
       </w:r>
       <w:r>
         <w:rPr>
@@ -2300,7 +2420,7 @@
       <w:pPr>
         <w:numPr>
           <w:ilvl w:val="1"/>
-          <w:numId w:val="1"/>
+          <w:numId w:val="2"/>
         </w:numPr>
         <w:spacing w:after="0" w:afterAutospacing="0"/>
         <w:ind w:left="1440" w:hanging="360"/>
@@ -2319,7 +2439,7 @@
       <w:pPr>
         <w:numPr>
           <w:ilvl w:val="1"/>
-          <w:numId w:val="1"/>
+          <w:numId w:val="2"/>
         </w:numPr>
         <w:ind w:left="1440" w:hanging="360"/>
         <w:rPr>
@@ -2375,83 +2495,240 @@
     </w:p>
     <w:p>
       <w:pPr>
+        <w:ind w:left="0" w:firstLine="0"/>
+        <w:rPr/>
+      </w:pPr>
+      <w:r>
+        <w:rPr>
+          <w:rtl w:val="0"/>
+        </w:rPr>
+      </w:r>
+    </w:p>
+    <w:p>
+      <w:pPr>
+        <w:ind w:left="0" w:firstLine="0"/>
+        <w:rPr/>
+      </w:pPr>
+      <w:r>
+        <w:rPr>
+          <w:rtl w:val="0"/>
+        </w:rPr>
+      </w:r>
+    </w:p>
+    <w:p>
+      <w:pPr>
         <w:pStyle w:val="Heading3"/>
         <w:rPr/>
       </w:pPr>
-      <w:bookmarkStart w:colFirst="0" w:colLast="0" w:name="_ssyl46fqrzfs" w:id="20"/>
+      <w:bookmarkStart w:colFirst="0" w:colLast="0" w:name="_ssyl46fqrzfs" w:id="19"/>
+      <w:bookmarkEnd w:id="19"/>
+      <w:r>
+        <w:rPr>
+          <w:rtl w:val="0"/>
+        </w:rPr>
+        <w:t xml:space="preserve">Command</w:t>
+      </w:r>
+    </w:p>
+    <w:p>
+      <w:pPr>
+        <w:rPr/>
+      </w:pPr>
+      <w:r>
+        <w:rPr>
+          <w:rtl w:val="0"/>
+        </w:rPr>
+        <w:t xml:space="preserve">Le patron de conception Command sera utilisé pour contrôler les interactions entre les joueurs et le serveur. Nous pourrons envoyer les commandes des joueurs, avec un timestamp, permettant de synchroniser les commandes des joueurs au serveur, même avec délai. Cette simplification des commandes peut également être appliquée au UI, pour définir des actions prédéfinies comme </w:t>
+      </w:r>
+      <w:r>
+        <w:rPr>
+          <w:i w:val="1"/>
+          <w:iCs w:val="1"/>
+          <w:rtl w:val="0"/>
+        </w:rPr>
+        <w:t xml:space="preserve">SAVE</w:t>
+      </w:r>
+      <w:r>
+        <w:rPr>
+          <w:rtl w:val="0"/>
+        </w:rPr>
+        <w:t xml:space="preserve">, </w:t>
+      </w:r>
+      <w:r>
+        <w:rPr>
+          <w:i w:val="1"/>
+          <w:iCs w:val="1"/>
+          <w:rtl w:val="0"/>
+        </w:rPr>
+        <w:t xml:space="preserve">LOAD_GAME</w:t>
+      </w:r>
+      <w:r>
+        <w:rPr>
+          <w:rtl w:val="0"/>
+        </w:rPr>
+        <w:t xml:space="preserve">, et pouvoir l’appliquer à plusieurs composantes d’interface différentes, ou même durant le gameplay. Bien sûr, les commandes du jeu suivent le patron Command, mais sont gérées par Godot lui-même.</w:t>
+      </w:r>
+    </w:p>
+    <w:p>
+      <w:pPr>
+        <w:rPr/>
+      </w:pPr>
+      <w:r>
+        <w:rPr>
+          <w:rtl w:val="0"/>
+        </w:rPr>
+      </w:r>
+    </w:p>
+    <w:p>
+      <w:pPr>
+        <w:pStyle w:val="Heading3"/>
+        <w:rPr/>
+      </w:pPr>
+      <w:bookmarkStart w:colFirst="0" w:colLast="0" w:name="_go8tfbv8nbwn" w:id="20"/>
       <w:bookmarkEnd w:id="20"/>
       <w:r>
         <w:rPr>
           <w:rtl w:val="0"/>
         </w:rPr>
+        <w:t xml:space="preserve">Intégration individuelle du projet de recherche de Veille technologique</w:t>
+      </w:r>
+    </w:p>
+    <w:p>
+      <w:pPr>
+        <w:rPr/>
+      </w:pPr>
+      <w:r>
+        <w:rPr>
+          <w:rtl w:val="0"/>
+        </w:rPr>
+        <w:t xml:space="preserve">Pour l’intégration de Godot 3D dans le projet, il est assez évident que notre engin de jeu sera Godot Engine. De plus, nous allons pousser l’utilisation de nouvelles Nodes, tels que </w:t>
+      </w:r>
+      <w:r>
+        <w:rPr>
+          <w:i w:val="1"/>
+          <w:iCs w:val="1"/>
+          <w:rtl w:val="0"/>
+        </w:rPr>
+        <w:t xml:space="preserve">GridMap</w:t>
+      </w:r>
+      <w:r>
+        <w:rPr>
+          <w:rtl w:val="0"/>
+        </w:rPr>
+        <w:t xml:space="preserve">, </w:t>
+      </w:r>
+      <w:r>
+        <w:rPr>
+          <w:i w:val="1"/>
+          <w:iCs w:val="1"/>
+          <w:rtl w:val="0"/>
+        </w:rPr>
+        <w:t xml:space="preserve">CharacterBody3D</w:t>
+      </w:r>
+      <w:r>
+        <w:rPr>
+          <w:rtl w:val="0"/>
+        </w:rPr>
+        <w:t xml:space="preserve">, et autres, afin de créer une expérience utilisant l’engin le plus possible. Nous allons beaucoup pousser sur la physique 3D afin de pouvoir concrètement pousser le monde 3D dans le jeu. </w:t>
+      </w:r>
+    </w:p>
+    <w:p>
+      <w:pPr>
+        <w:rPr/>
+      </w:pPr>
+      <w:r>
+        <w:rPr>
+          <w:rtl w:val="0"/>
+        </w:rPr>
+      </w:r>
+    </w:p>
+    <w:p>
+      <w:pPr>
+        <w:rPr/>
+      </w:pPr>
+      <w:r>
+        <w:rPr>
+          <w:rtl w:val="0"/>
+        </w:rPr>
+        <w:t xml:space="preserve">Firebase est une plateforme Backend-as-a-Service (BaaS) développée par google qui permet de facilement intégrer la gestion de l’authentification, le stockage de données avec Firestore et la gestion sécurisée des utilisateurs. Dans le contexte de notre jeu, firebase sera utilisé pour notre login pour que les utilisateurs puissent se créer des compte et se connecter sur leur compte a partir de différents ordinateurs. Il y aura aussi une certaine sécurité pour empêcher le “spam” de création de compte en intégrant la vérification par courriel. Nous utiliserons aussi firestore pour sauvegarder l’etats des parties et pour charger les parties lorsqu’on reprend une partie. En bref, il nous permettra de rapidement instaurer une architecture pour le login et la base de données afin qu’on puissent passer plus de temps à faire le jeu en tant que tel. Et il pourra facilement être scalable et facile à remplacer plus tard. </w:t>
+      </w:r>
+    </w:p>
+    <w:p>
+      <w:pPr>
+        <w:rPr/>
+      </w:pPr>
+      <w:r>
+        <w:rPr>
+          <w:rtl w:val="0"/>
+        </w:rPr>
+      </w:r>
+    </w:p>
+    <w:p>
+      <w:pPr>
+        <w:rPr/>
+      </w:pPr>
+      <w:r>
+        <w:rPr>
+          <w:rtl w:val="0"/>
+        </w:rPr>
+        <w:t xml:space="preserve">Changements effectués au document:</w:t>
+      </w:r>
+    </w:p>
+    <w:p>
+      <w:pPr>
+        <w:rPr/>
+      </w:pPr>
+      <w:r>
+        <w:rPr>
+          <w:rtl w:val="0"/>
+        </w:rPr>
+        <w:t xml:space="preserve">2/03/2026 12:00 - Jean-Marc : Changement du  patron de conception Flyweight pour le patron de conception Command, car Flyweight, autant qu’il est économe sur la mémoire, est vorace sur la puissance CPU. Certains tests préliminaires ont montré une performance atroce comparé à une interface Réseau standard (Tests générés par IA). Le patron de conception </w:t>
+      </w:r>
+      <w:r>
+        <w:rPr>
+          <w:i w:val="1"/>
+          <w:iCs w:val="1"/>
+          <w:rtl w:val="0"/>
+        </w:rPr>
         <w:t xml:space="preserve">Command</w:t>
       </w:r>
-    </w:p>
-    <w:p>
-      <w:pPr>
-        <w:rPr/>
-      </w:pPr>
-      <w:r>
-        <w:rPr>
-          <w:rtl w:val="0"/>
-        </w:rPr>
-        <w:t xml:space="preserve">Le patron de conception Command sera principalement utilisé pour </w:t>
-      </w:r>
-      <w:hyperlink r:id="rId28">
-        <w:r>
-          <w:rPr>
-            <w:color w:val="1155cc"/>
-            <w:u w:val="single"/>
-            <w:rtl w:val="0"/>
-          </w:rPr>
-          <w:t xml:space="preserve">gérer les touches du jeu</w:t>
-        </w:r>
-      </w:hyperlink>
-      <w:r>
-        <w:rPr>
-          <w:rtl w:val="0"/>
-        </w:rPr>
-        <w:t xml:space="preserve"> de façon efficace. Ce patron peut être comparé avec les callbacks, </w:t>
-      </w:r>
-    </w:p>
-    <w:p>
-      <w:pPr>
-        <w:rPr/>
-      </w:pPr>
-      <w:r>
-        <w:rPr>
-          <w:rtl w:val="0"/>
-        </w:rPr>
-      </w:r>
-    </w:p>
-    <w:p>
-      <w:pPr>
-        <w:pStyle w:val="Heading3"/>
-        <w:rPr/>
-      </w:pPr>
-      <w:bookmarkStart w:colFirst="0" w:colLast="0" w:name="_go8tfbv8nbwn" w:id="21"/>
-      <w:bookmarkEnd w:id="21"/>
-      <w:r>
-        <w:rPr>
-          <w:rtl w:val="0"/>
-        </w:rPr>
-        <w:t xml:space="preserve">Intégration individuelle du projet de recherche de Veille technologique</w:t>
-      </w:r>
-    </w:p>
-    <w:p>
-      <w:pPr>
-        <w:rPr/>
-      </w:pPr>
-      <w:r>
-        <w:rPr>
-          <w:rtl w:val="0"/>
-        </w:rPr>
-      </w:r>
-    </w:p>
-    <w:p>
-      <w:pPr>
-        <w:rPr/>
-      </w:pPr>
+      <w:r>
+        <w:rPr>
+          <w:rtl w:val="0"/>
+        </w:rPr>
+        <w:t xml:space="preserve"> peut être élargi pour aussi contrôler les commandes des joueurs et assurer la synchronisation des joueurs avec le serveur.</w:t>
+      </w:r>
+    </w:p>
+    <w:p>
+      <w:pPr>
+        <w:rPr/>
+      </w:pPr>
+      <w:r>
+        <w:rPr>
+          <w:rtl w:val="0"/>
+        </w:rPr>
+      </w:r>
+    </w:p>
+    <w:p>
+      <w:pPr>
+        <w:rPr/>
+      </w:pPr>
+      <w:r>
+        <w:rPr>
+          <w:rtl w:val="0"/>
+        </w:rPr>
+        <w:t xml:space="preserve">2026-04-04 - Samuel bergeron</w:t>
+      </w:r>
+    </w:p>
+    <w:p>
+      <w:pPr>
+        <w:rPr/>
+      </w:pPr>
+      <w:r>
+        <w:rPr>
+          <w:rtl w:val="0"/>
+        </w:rPr>
+        <w:t xml:space="preserve">Ajout du paragraphe de firebase explication de l'intégration de la technologie.</w:t>
+      </w:r>
       <w:r>
         <w:rPr>
           <w:rtl w:val="0"/>
@@ -2465,66 +2742,6 @@
     </w:sectPr>
   </w:body>
 </w:document>
-</file>
-
-<file path=word/comments.xml><?xml version="1.0" encoding="utf-8"?>
-<w:comments xmlns:mc="http://schemas.openxmlformats.org/markup-compatibility/2006" xmlns:o="urn:schemas-microsoft-com:office:office" xmlns:r="http://schemas.openxmlformats.org/officeDocument/2006/relationships" xmlns:m="http://schemas.openxmlformats.org/officeDocument/2006/math" xmlns:v="urn:schemas-microsoft-com:vml" xmlns:wp="http://schemas.openxmlformats.org/drawingml/2006/wordprocessingDrawing" xmlns:w10="urn:schemas-microsoft-com:office:word" xmlns:w="http://schemas.openxmlformats.org/wordprocessingml/2006/main" xmlns:wne="http://schemas.microsoft.com/office/word/2006/wordml" xmlns:sl="http://schemas.openxmlformats.org/schemaLibrary/2006/main" xmlns:a="http://schemas.openxmlformats.org/drawingml/2006/main" xmlns:pic="http://schemas.openxmlformats.org/drawingml/2006/picture" xmlns:c="http://schemas.openxmlformats.org/drawingml/2006/chart" xmlns:lc="http://schemas.openxmlformats.org/drawingml/2006/lockedCanvas" xmlns:dgm="http://schemas.openxmlformats.org/drawingml/2006/diagram" xmlns:wps="http://schemas.microsoft.com/office/word/2010/wordprocessingShape" xmlns:wpg="http://schemas.microsoft.com/office/word/2010/wordprocessingGroup" xmlns:w14="http://schemas.microsoft.com/office/word/2010/wordml" xmlns:w15="http://schemas.microsoft.com/office/word/2012/wordml" xmlns:w16="http://schemas.microsoft.com/office/word/2018/wordml" xmlns:w16cex="http://schemas.microsoft.com/office/word/2018/wordml/cex" xmlns:w16cid="http://schemas.microsoft.com/office/word/2016/wordml/cid" xmlns="http://schemas.microsoft.com/office/tasks/2019/documenttasks" xmlns:cr="http://schemas.microsoft.com/office/comments/2020/reactions">
-  <w:comment w:author="Jean-Marc Bouchard" w:id="0" w:date="2026-02-16T13:13:28Z">
-    <w:p>
-      <w:pPr>
-        <w:keepNext w:val="0"/>
-        <w:keepLines w:val="0"/>
-        <w:pageBreakBefore w:val="0"/>
-        <w:widowControl w:val="0"/>
-        <w:pBdr>
-          <w:top w:space="0" w:sz="0" w:val="nil"/>
-          <w:left w:space="0" w:sz="0" w:val="nil"/>
-          <w:bottom w:space="0" w:sz="0" w:val="nil"/>
-          <w:right w:space="0" w:sz="0" w:val="nil"/>
-          <w:between w:space="0" w:sz="0" w:val="nil"/>
-        </w:pBdr>
-        <w:shd w:fill="auto" w:val="clear"/>
-        <w:spacing w:after="0" w:before="0" w:line="240" w:lineRule="auto"/>
-        <w:ind w:left="0" w:right="0" w:firstLine="0"/>
-        <w:jc w:val="left"/>
-        <w:rPr>
-          <w:rFonts w:ascii="Arial" w:cs="Arial" w:eastAsia="Arial" w:hAnsi="Arial"/>
-          <w:b w:val="0"/>
-          <w:bCs w:val="0"/>
-          <w:i w:val="0"/>
-          <w:iCs w:val="0"/>
-          <w:smallCaps w:val="0"/>
-          <w:strike w:val="0"/>
-          <w:color w:val="000000"/>
-          <w:sz w:val="22"/>
-          <w:szCs w:val="22"/>
-          <w:u w:val="none"/>
-          <w:shd w:fill="auto" w:val="clear"/>
-          <w:vertAlign w:val="baseline"/>
-        </w:rPr>
-      </w:pPr>
-      <w:r>
-        <w:rPr>
-          <w:rFonts w:ascii="Arial" w:cs="Arial" w:eastAsia="Arial" w:hAnsi="Arial"/>
-          <w:b w:val="0"/>
-          <w:bCs w:val="0"/>
-          <w:i w:val="0"/>
-          <w:iCs w:val="0"/>
-          <w:smallCaps w:val="0"/>
-          <w:strike w:val="0"/>
-          <w:color w:val="000000"/>
-          <w:sz w:val="22"/>
-          <w:szCs w:val="22"/>
-          <w:u w:val="none"/>
-          <w:shd w:fill="auto" w:val="clear"/>
-          <w:vertAlign w:val="baseline"/>
-          <w:rtl w:val="0"/>
-        </w:rPr>
-        <w:t xml:space="preserve">caca</w:t>
-      </w:r>
-    </w:p>
-  </w:comment>
-</w:comments>
 </file>
 
 <file path=word/numbering.xml><?xml version="1.0" encoding="utf-8"?>
@@ -2639,8 +2856,121 @@
       </w:rPr>
     </w:lvl>
   </w:abstractNum>
+  <w:abstractNum w:abstractNumId="2">
+    <w:lvl w:ilvl="0">
+      <w:start w:val="1"/>
+      <w:numFmt w:val="bullet"/>
+      <w:lvlText w:val="-"/>
+      <w:lvlJc w:val="left"/>
+      <w:pPr>
+        <w:ind w:left="720" w:hanging="360"/>
+      </w:pPr>
+      <w:rPr>
+        <w:u w:val="none"/>
+      </w:rPr>
+    </w:lvl>
+    <w:lvl w:ilvl="1">
+      <w:start w:val="1"/>
+      <w:numFmt w:val="bullet"/>
+      <w:lvlText w:val="-"/>
+      <w:lvlJc w:val="left"/>
+      <w:pPr>
+        <w:ind w:left="1440" w:hanging="360"/>
+      </w:pPr>
+      <w:rPr>
+        <w:u w:val="none"/>
+      </w:rPr>
+    </w:lvl>
+    <w:lvl w:ilvl="2">
+      <w:start w:val="1"/>
+      <w:numFmt w:val="bullet"/>
+      <w:lvlText w:val="-"/>
+      <w:lvlJc w:val="left"/>
+      <w:pPr>
+        <w:ind w:left="2160" w:hanging="360"/>
+      </w:pPr>
+      <w:rPr>
+        <w:u w:val="none"/>
+      </w:rPr>
+    </w:lvl>
+    <w:lvl w:ilvl="3">
+      <w:start w:val="1"/>
+      <w:numFmt w:val="bullet"/>
+      <w:lvlText w:val="-"/>
+      <w:lvlJc w:val="left"/>
+      <w:pPr>
+        <w:ind w:left="2880" w:hanging="360"/>
+      </w:pPr>
+      <w:rPr>
+        <w:u w:val="none"/>
+      </w:rPr>
+    </w:lvl>
+    <w:lvl w:ilvl="4">
+      <w:start w:val="1"/>
+      <w:numFmt w:val="bullet"/>
+      <w:lvlText w:val="-"/>
+      <w:lvlJc w:val="left"/>
+      <w:pPr>
+        <w:ind w:left="3600" w:hanging="360"/>
+      </w:pPr>
+      <w:rPr>
+        <w:u w:val="none"/>
+      </w:rPr>
+    </w:lvl>
+    <w:lvl w:ilvl="5">
+      <w:start w:val="1"/>
+      <w:numFmt w:val="bullet"/>
+      <w:lvlText w:val="-"/>
+      <w:lvlJc w:val="left"/>
+      <w:pPr>
+        <w:ind w:left="4320" w:hanging="360"/>
+      </w:pPr>
+      <w:rPr>
+        <w:u w:val="none"/>
+      </w:rPr>
+    </w:lvl>
+    <w:lvl w:ilvl="6">
+      <w:start w:val="1"/>
+      <w:numFmt w:val="bullet"/>
+      <w:lvlText w:val="-"/>
+      <w:lvlJc w:val="left"/>
+      <w:pPr>
+        <w:ind w:left="5040" w:hanging="360"/>
+      </w:pPr>
+      <w:rPr>
+        <w:u w:val="none"/>
+      </w:rPr>
+    </w:lvl>
+    <w:lvl w:ilvl="7">
+      <w:start w:val="1"/>
+      <w:numFmt w:val="bullet"/>
+      <w:lvlText w:val="-"/>
+      <w:lvlJc w:val="left"/>
+      <w:pPr>
+        <w:ind w:left="5760" w:hanging="360"/>
+      </w:pPr>
+      <w:rPr>
+        <w:u w:val="none"/>
+      </w:rPr>
+    </w:lvl>
+    <w:lvl w:ilvl="8">
+      <w:start w:val="1"/>
+      <w:numFmt w:val="bullet"/>
+      <w:lvlText w:val="-"/>
+      <w:lvlJc w:val="left"/>
+      <w:pPr>
+        <w:ind w:left="6480" w:hanging="360"/>
+      </w:pPr>
+      <w:rPr>
+        <w:u w:val="none"/>
+      </w:rPr>
+    </w:lvl>
+  </w:abstractNum>
   <w:num w:numId="1">
     <w:abstractNumId w:val="1"/>
+  </w:num>
+  <w:num w:numId="2">
+    <w:abstractNumId w:val="2"/>
   </w:num>
 </w:numbering>
 </file>

</xml_diff>